<commit_message>
feat: selesaikan seluruh revisi pembimbing 2 (panel antrian login, fix cek NIK, validasi tensi, autofill petugas & NIP, dan pencegahan input ganda)
</commit_message>
<xml_diff>
--- a/docs_skripsi/uml/4.1_Analisis_Sistem.docx
+++ b/docs_skripsi/uml/4.1_Analisis_Sistem.docx
@@ -32,6 +32,7 @@
           <w:szCs w:val="24"/>
         </w:rPr>
       </w:pPr>
+      <w:bookmarkStart w:id="0" w:name="_Hlk240560417"/>
       <w:r>
         <w:rPr>
           <w:rFonts w:ascii="Times New Roman" w:hAnsi="Times New Roman" w:cs="Times New Roman"/>
@@ -2081,7 +2082,25 @@
           <w:sz w:val="24"/>
           <w:szCs w:val="24"/>
         </w:rPr>
-        <w:t xml:space="preserve"> terintegrasi yang diusulkan divisualisasikan melalui diagram alur (flowmap) pada Gambar 4.x berikut:</w:t>
+        <w:t xml:space="preserve"> terintegrasi yang diusulkan divisualisasikan melalui diagram alur (</w:t>
+      </w:r>
+      <w:r>
+        <w:rPr>
+          <w:rFonts w:ascii="Times New Roman" w:hAnsi="Times New Roman" w:cs="Times New Roman"/>
+          <w:i/>
+          <w:iCs/>
+          <w:sz w:val="24"/>
+          <w:szCs w:val="24"/>
+        </w:rPr>
+        <w:t>flowmap</w:t>
+      </w:r>
+      <w:r>
+        <w:rPr>
+          <w:rFonts w:ascii="Times New Roman" w:hAnsi="Times New Roman" w:cs="Times New Roman"/>
+          <w:sz w:val="24"/>
+          <w:szCs w:val="24"/>
+        </w:rPr>
+        <w:t>) pada Gambar 4.x berikut:</w:t>
       </w:r>
     </w:p>
     <w:tbl>
@@ -3215,7 +3234,29 @@
           <w:sz w:val="24"/>
           <w:szCs w:val="24"/>
         </w:rPr>
-        <w:t xml:space="preserve">4.1.3 Analisis Kebutuhan Sistem (System </w:t>
+        <w:t>4.1.3 Analisis Kebutuhan Sistem (</w:t>
+      </w:r>
+      <w:r>
+        <w:rPr>
+          <w:rFonts w:ascii="Times New Roman" w:hAnsi="Times New Roman" w:cs="Times New Roman"/>
+          <w:b/>
+          <w:i/>
+          <w:iCs/>
+          <w:sz w:val="24"/>
+          <w:szCs w:val="24"/>
+        </w:rPr>
+        <w:t xml:space="preserve">System </w:t>
+      </w:r>
+      <w:r>
+        <w:rPr>
+          <w:rFonts w:ascii="Times New Roman" w:hAnsi="Times New Roman" w:cs="Times New Roman"/>
+          <w:b/>
+          <w:i/>
+          <w:iCs/>
+          <w:sz w:val="24"/>
+          <w:szCs w:val="24"/>
+        </w:rPr>
+        <w:t>Requirements</w:t>
       </w:r>
       <w:r>
         <w:rPr>
@@ -3224,7 +3265,7 @@
           <w:sz w:val="24"/>
           <w:szCs w:val="24"/>
         </w:rPr>
-        <w:t>Requirements)</w:t>
+        <w:t>)</w:t>
       </w:r>
     </w:p>
     <w:p>
@@ -3271,7 +3312,27 @@
           <w:sz w:val="24"/>
           <w:szCs w:val="24"/>
         </w:rPr>
-        <w:t>1. Analisis Kebutuhan Fungsional (Functional Requirements)</w:t>
+        <w:t>1. Analisis Kebutuhan Fungsional (</w:t>
+      </w:r>
+      <w:r>
+        <w:rPr>
+          <w:rFonts w:ascii="Times New Roman" w:hAnsi="Times New Roman" w:cs="Times New Roman"/>
+          <w:b/>
+          <w:i/>
+          <w:iCs/>
+          <w:sz w:val="24"/>
+          <w:szCs w:val="24"/>
+        </w:rPr>
+        <w:t>Functional Requirements</w:t>
+      </w:r>
+      <w:r>
+        <w:rPr>
+          <w:rFonts w:ascii="Times New Roman" w:hAnsi="Times New Roman" w:cs="Times New Roman"/>
+          <w:b/>
+          <w:sz w:val="24"/>
+          <w:szCs w:val="24"/>
+        </w:rPr>
+        <w:t>)</w:t>
       </w:r>
     </w:p>
     <w:p>
@@ -5664,6 +5725,7 @@
           </w:p>
         </w:tc>
       </w:tr>
+      <w:bookmarkEnd w:id="0"/>
     </w:tbl>
     <w:p>
       <w:pPr>

</xml_diff>